<commit_message>
docs(module2): add Word previews and solarised lecture links
</commit_message>
<xml_diff>
--- a/word/beda-reference.docx
+++ b/word/beda-reference.docx
@@ -506,12 +506,13 @@
     <w:qFormat/>
     <w:pPr>
       <w:widowControl/>
-      <w:spacing w:after="120" w:line="276" w:lineRule="auto"/>
-    </w:pPr>
-    <w:rPr>
-      <w:rFonts w:ascii="Georgia" w:hAnsi="Georgia" w:eastAsia="Georgia" w:cs="Georgia"/>
-      <w:color w:val="142326"/>
-      <w:sz w:val="21"/>
+      <w:spacing w:after="0" w:line="480" w:lineRule="auto"/>
+    </w:pPr>
+    <w:rPr>
+      <w:rFonts w:ascii="Times New Roman" w:hAnsi="Times New Roman" w:eastAsia="Times New Roman" w:cs="Times New Roman"/>
+      <w:color w:val="000000"/>
+      <w:sz w:val="24"/>
+      <w:szCs w:val="24"/>
     </w:rPr>
   </w:style>
   <w:style xmlns:r="http://schemas.openxmlformats.org/officeDocument/2006/relationships" xmlns:w="http://schemas.openxmlformats.org/wordprocessingml/2006/main" w:type="paragraph" w:styleId="BodyText">
@@ -547,19 +548,16 @@
     <w:rsid w:val="00A10FD9"/>
     <w:pPr>
       <w:keepNext/>
-      <w:pBdr>
-        <w:bottom w:val="single" w:color="6B210F" w:sz="18"/>
-      </w:pBdr>
       <w:spacing w:after="160" w:line="240" w:lineRule="auto"/>
       <w:contextualSpacing/>
-      <w:jc w:val="left"/>
-    </w:pPr>
-    <w:rPr>
-      <w:rFonts w:ascii="Georgia" w:hAnsi="Georgia" w:eastAsia="Georgia" w:cs="Georgia"/>
+      <w:jc w:val="center"/>
+    </w:pPr>
+    <w:rPr>
+      <w:rFonts w:ascii="Times New Roman" w:hAnsi="Times New Roman" w:eastAsia="Times New Roman" w:cs="Times New Roman"/>
       <w:b/>
-      <w:color w:val="482878"/>
-      <w:sz w:val="48"/>
-      <w:szCs w:val="56"/>
+      <w:color w:val="000000"/>
+      <w:sz w:val="32"/>
+      <w:szCs w:val="32"/>
     </w:rPr>
   </w:style>
   <w:style xmlns:r="http://schemas.openxmlformats.org/officeDocument/2006/relationships" xmlns:w="http://schemas.openxmlformats.org/wordprocessingml/2006/main" w:type="character" w:styleId="TitleChar" w:customStyle="1">
@@ -587,15 +585,16 @@
         <w:ilvl w:val="1"/>
       </w:numPr>
       <w:spacing w:after="280"/>
-    </w:pPr>
-    <w:rPr>
-      <w:rFonts w:ascii="Aptos" w:hAnsi="Aptos" w:eastAsia="Aptos" w:cs="Aptos"/>
-      <w:b/>
-      <w:smallCaps/>
-      <w:color w:val="0F6B5B"/>
-      <w:spacing w:val="30"/>
-      <w:sz w:val="18"/>
-      <w:szCs w:val="28"/>
+      <w:jc w:val="center"/>
+    </w:pPr>
+    <w:rPr>
+      <w:rFonts w:ascii="Times New Roman" w:hAnsi="Times New Roman" w:eastAsia="Times New Roman" w:cs="Times New Roman"/>
+      <w:b w:val="false"/>
+      <w:smallCaps w:val="false"/>
+      <w:color w:val="000000"/>
+      <w:spacing w:val="0"/>
+      <w:sz w:val="24"/>
+      <w:szCs w:val="24"/>
     </w:rPr>
   </w:style>
   <w:style xmlns:r="http://schemas.openxmlformats.org/officeDocument/2006/relationships" xmlns:w="http://schemas.openxmlformats.org/wordprocessingml/2006/main" w:type="character" w:styleId="SubtitleChar" w:customStyle="1">
@@ -620,10 +619,11 @@
     <w:pPr>
       <w:keepNext/>
       <w:keepLines/>
-    </w:pPr>
-    <w:rPr>
-      <w:rFonts w:ascii="Georgia" w:hAnsi="Georgia" w:eastAsia="Georgia" w:cs="Georgia"/>
-      <w:color w:val="536366"/>
+      <w:jc w:val="center"/>
+    </w:pPr>
+    <w:rPr>
+      <w:rFonts w:ascii="Times New Roman" w:hAnsi="Times New Roman" w:eastAsia="Times New Roman" w:cs="Times New Roman"/>
+      <w:color w:val="000000"/>
       <w:sz w:val="24"/>
       <w:szCs w:val="24"/>
     </w:rPr>
@@ -636,10 +636,11 @@
     <w:pPr>
       <w:keepNext/>
       <w:keepLines/>
-    </w:pPr>
-    <w:rPr>
-      <w:rFonts w:ascii="Georgia" w:hAnsi="Georgia" w:eastAsia="Georgia" w:cs="Georgia"/>
-      <w:color w:val="536366"/>
+      <w:jc w:val="center"/>
+    </w:pPr>
+    <w:rPr>
+      <w:rFonts w:ascii="Times New Roman" w:hAnsi="Times New Roman" w:eastAsia="Times New Roman" w:cs="Times New Roman"/>
+      <w:color w:val="000000"/>
       <w:sz w:val="24"/>
       <w:szCs w:val="24"/>
     </w:rPr>
@@ -700,11 +701,11 @@
       <w:outlineLvl xmlns:w="http://schemas.openxmlformats.org/wordprocessingml/2006/main" w:val="0"/>
     </w:pPr>
     <w:rPr>
-      <w:rFonts w:ascii="Georgia" w:hAnsi="Georgia" w:eastAsia="Georgia" w:cs="Georgia"/>
+      <w:rFonts w:ascii="Times New Roman" w:hAnsi="Times New Roman" w:eastAsia="Times New Roman" w:cs="Times New Roman"/>
       <w:b/>
-      <w:color w:val="482878"/>
-      <w:sz w:val="40"/>
-      <w:szCs w:val="40"/>
+      <w:color w:val="000000"/>
+      <w:sz w:val="28"/>
+      <w:szCs w:val="28"/>
     </w:rPr>
   </w:style>
   <w:style xmlns:r="http://schemas.openxmlformats.org/officeDocument/2006/relationships" xmlns:w="http://schemas.openxmlformats.org/wordprocessingml/2006/main" w:type="paragraph" w:styleId="Heading2">
@@ -725,11 +726,11 @@
       <w:outlineLvl xmlns:w="http://schemas.openxmlformats.org/wordprocessingml/2006/main" w:val="1"/>
     </w:pPr>
     <w:rPr>
-      <w:rFonts w:ascii="Georgia" w:hAnsi="Georgia" w:eastAsia="Georgia" w:cs="Georgia"/>
+      <w:rFonts w:ascii="Times New Roman" w:hAnsi="Times New Roman" w:eastAsia="Times New Roman" w:cs="Times New Roman"/>
       <w:b/>
-      <w:color w:val="482878"/>
-      <w:sz w:val="30"/>
-      <w:szCs w:val="32"/>
+      <w:color w:val="000000"/>
+      <w:sz w:val="24"/>
+      <w:szCs w:val="24"/>
     </w:rPr>
   </w:style>
   <w:style xmlns:r="http://schemas.openxmlformats.org/officeDocument/2006/relationships" xmlns:w="http://schemas.openxmlformats.org/wordprocessingml/2006/main" w:type="paragraph" w:styleId="Heading3">
@@ -749,12 +750,12 @@
       <w:outlineLvl w:val="2"/>
     </w:pPr>
     <w:rPr>
-      <w:rFonts w:ascii="Georgia" w:hAnsi="Georgia" w:eastAsia="Georgia" w:cs="Georgia"/>
+      <w:rFonts w:ascii="Times New Roman" w:hAnsi="Times New Roman" w:eastAsia="Times New Roman" w:cs="Times New Roman"/>
       <w:b/>
       <w:bCs/>
-      <w:color w:val="482878"/>
-      <w:sz w:val="26"/>
-      <w:szCs w:val="26"/>
+      <w:color w:val="000000"/>
+      <w:sz w:val="24"/>
+      <w:szCs w:val="24"/>
     </w:rPr>
   </w:style>
   <w:style xmlns:r="http://schemas.openxmlformats.org/officeDocument/2006/relationships" xmlns:w="http://schemas.openxmlformats.org/wordprocessingml/2006/main" w:type="paragraph" w:styleId="Heading4">
@@ -1045,11 +1046,17 @@
     <w:semiHidden/>
     <w:unhideWhenUsed/>
   </w:style>
-  <w:style xmlns:r="http://schemas.openxmlformats.org/officeDocument/2006/relationships" xmlns:w="http://schemas.openxmlformats.org/wordprocessingml/2006/main" w:type="table" w:default="1" w:styleId="TableNormal">
+  <w:style xmlns:r="http://schemas.openxmlformats.org/officeDocument/2006/relationships" xmlns:w="http://schemas.openxmlformats.org/wordprocessingml/2006/main" w:type="table" w:styleId="TableNormal" w:default="1">
     <w:name w:val="Normal Table"/>
     <w:uiPriority w:val="99"/>
     <w:semiHidden/>
     <w:unhideWhenUsed/>
+    <w:rPr xmlns:w="http://schemas.openxmlformats.org/wordprocessingml/2006/main">
+      <w:rFonts w:ascii="Times New Roman" w:hAnsi="Times New Roman" w:eastAsia="Times New Roman" w:cs="Times New Roman"/>
+      <w:color w:val="000000"/>
+      <w:sz w:val="20"/>
+      <w:szCs w:val="20"/>
+    </w:rPr>
     <w:tblPr>
       <w:tblInd w:w="0" w:type="dxa"/>
       <w:tblCellMar>
@@ -1190,17 +1197,186 @@
     <w:qFormat/>
     <w:pPr>
       <w:keepLines/>
+      <w:spacing w:before="160" w:after="200"/>
+    </w:pPr>
+    <w:rPr>
+      <w:rFonts w:ascii="Times New Roman" w:hAnsi="Times New Roman" w:eastAsia="Times New Roman" w:cs="Times New Roman"/>
+      <w:color w:val="000000"/>
+      <w:sz w:val="21"/>
+    </w:rPr>
+  </w:style>
+  <w:style xmlns:r="http://schemas.openxmlformats.org/officeDocument/2006/relationships" xmlns:w="http://schemas.openxmlformats.org/wordprocessingml/2006/main" w:type="paragraph" w:styleId="BEDACoverUniversity" w:customStyle="true">
+    <w:name w:val="BEDA Cover University"/>
+    <w:basedOn w:val="Normal"/>
+    <w:next w:val="Normal"/>
+    <w:qFormat/>
+    <w:pPr>
+      <w:keepNext xmlns:w="http://schemas.openxmlformats.org/wordprocessingml/2006/main" w:val="1"/>
+      <w:spacing w:before="480" w:after="360"/>
+      <w:jc w:val="left"/>
+    </w:pPr>
+    <w:rPr>
+      <w:rFonts w:ascii="Georgia" w:hAnsi="Georgia" w:eastAsia="Georgia"/>
+      <w:smallCaps/>
+      <w:color w:val="0F6B5B"/>
+      <w:spacing w:val="40"/>
+      <w:sz w:val="26"/>
+    </w:rPr>
+  </w:style>
+  <w:style xmlns:r="http://schemas.openxmlformats.org/officeDocument/2006/relationships" xmlns:w="http://schemas.openxmlformats.org/wordprocessingml/2006/main" w:type="paragraph" w:styleId="BEDACoverSemester" w:customStyle="true">
+    <w:name w:val="BEDA Cover Semester"/>
+    <w:basedOn w:val="Normal"/>
+    <w:next w:val="Normal"/>
+    <w:qFormat/>
+    <w:pPr>
+      <w:keepNext xmlns:w="http://schemas.openxmlformats.org/wordprocessingml/2006/main" w:val="1"/>
+      <w:spacing w:before="240" w:after="0"/>
+      <w:jc w:val="left"/>
+    </w:pPr>
+    <w:rPr>
+      <w:rFonts w:ascii="Georgia" w:hAnsi="Georgia" w:eastAsia="Georgia"/>
+      <w:color w:val="0F6B5B"/>
+      <w:sz w:val="23"/>
+    </w:rPr>
+  </w:style>
+  <w:style xmlns:r="http://schemas.openxmlformats.org/officeDocument/2006/relationships" xmlns:w="http://schemas.openxmlformats.org/wordprocessingml/2006/main" w:type="paragraph" w:styleId="BEDAChapterHeading" w:customStyle="true">
+    <w:name w:val="BEDA Chapter Heading"/>
+    <w:basedOn w:val="Heading1"/>
+    <w:next w:val="BodyText"/>
+    <w:qFormat/>
+    <w:pPr>
+      <w:pageBreakBefore xmlns:w="http://schemas.openxmlformats.org/wordprocessingml/2006/main" w:val="1"/>
+    </w:pPr>
+    <w:rPr>
+      <w:color w:val="482878"/>
+    </w:rPr>
+  </w:style>
+  <w:style xmlns:r="http://schemas.openxmlformats.org/officeDocument/2006/relationships" xmlns:w="http://schemas.openxmlformats.org/wordprocessingml/2006/main" w:type="paragraph" w:styleId="BEDATimelineHeading" w:customStyle="true">
+    <w:name w:val="BEDA Timeline Heading"/>
+    <w:basedOn w:val="Heading1"/>
+    <w:next w:val="BodyText"/>
+    <w:qFormat/>
+    <w:pPr>
+      <w:pageBreakBefore xmlns:w="http://schemas.openxmlformats.org/wordprocessingml/2006/main" w:val="1"/>
+    </w:pPr>
+    <w:rPr>
+      <w:color w:val="482878"/>
+    </w:rPr>
+  </w:style>
+  <w:style xmlns:r="http://schemas.openxmlformats.org/officeDocument/2006/relationships" xmlns:w="http://schemas.openxmlformats.org/wordprocessingml/2006/main" w:type="paragraph" w:styleId="MockupCentredTitle" w:customStyle="true">
+    <w:name w:val="MockupCentredTitle"/>
+    <w:basedOn w:val="Normal"/>
+    <w:qFormat/>
+    <w:pPr>
+      <w:jc w:val="center"/>
+    </w:pPr>
+    <w:rPr>
+      <w:rFonts w:ascii="Times New Roman" w:hAnsi="Times New Roman" w:eastAsia="Times New Roman" w:cs="Times New Roman"/>
+      <w:b/>
+      <w:color w:val="000000"/>
+      <w:sz w:val="36"/>
+    </w:rPr>
+  </w:style>
+  <w:style xmlns:r="http://schemas.openxmlformats.org/officeDocument/2006/relationships" xmlns:w="http://schemas.openxmlformats.org/wordprocessingml/2006/main" w:type="paragraph" w:styleId="MockupLeftTitle" w:customStyle="true">
+    <w:name w:val="MockupLeftTitle"/>
+    <w:basedOn w:val="Normal"/>
+    <w:qFormat/>
+    <w:pPr>
+      <w:jc w:val="left"/>
+    </w:pPr>
+    <w:rPr>
+      <w:rFonts w:ascii="Times New Roman" w:hAnsi="Times New Roman" w:eastAsia="Times New Roman" w:cs="Times New Roman"/>
+      <w:b/>
+      <w:color w:val="000000"/>
+      <w:sz w:val="32"/>
+    </w:rPr>
+  </w:style>
+  <w:style xmlns:r="http://schemas.openxmlformats.org/officeDocument/2006/relationships" xmlns:w="http://schemas.openxmlformats.org/wordprocessingml/2006/main" w:type="paragraph" w:styleId="MockupRule" w:customStyle="true">
+    <w:name w:val="MockupRule"/>
+    <w:basedOn w:val="Normal"/>
+    <w:qFormat/>
+    <w:pPr>
       <w:pBdr>
-        <w:left w:val="single" w:color="6B210F" w:sz="18"/>
+        <w:bottom w:val="single" w:sz="4"/>
       </w:pBdr>
-      <w:shd w:val="clear" w:fill="F7E9E5"/>
-      <w:spacing w:before="160" w:after="200"/>
-    </w:pPr>
-    <w:rPr>
-      <w:rFonts w:ascii="Georgia" w:hAnsi="Georgia" w:eastAsia="Georgia" w:cs="Georgia"/>
-      <w:color w:val="142326"/>
-      <w:sz w:val="21"/>
-    </w:rPr>
+      <w:spacing w:before="120" w:after="240" w:line="240" w:lineRule="auto"/>
+    </w:pPr>
+    <w:rPr>
+      <w:rFonts w:ascii="Times New Roman" w:hAnsi="Times New Roman" w:eastAsia="Times New Roman" w:cs="Times New Roman"/>
+      <w:color w:val="000000"/>
+    </w:rPr>
+  </w:style>
+  <w:style xmlns:r="http://schemas.openxmlformats.org/officeDocument/2006/relationships" xmlns:w="http://schemas.openxmlformats.org/wordprocessingml/2006/main" w:type="paragraph" w:styleId="MockupLabel" w:customStyle="true">
+    <w:name w:val="MockupLabel"/>
+    <w:basedOn w:val="Normal"/>
+    <w:qFormat/>
+    <w:pPr>
+      <w:jc w:val="left"/>
+    </w:pPr>
+    <w:rPr>
+      <w:rFonts w:ascii="Times New Roman" w:hAnsi="Times New Roman" w:eastAsia="Times New Roman" w:cs="Times New Roman"/>
+      <w:b/>
+      <w:i/>
+      <w:color w:val="000000"/>
+      <w:sz w:val="22"/>
+    </w:rPr>
+  </w:style>
+  <w:style xmlns:r="http://schemas.openxmlformats.org/officeDocument/2006/relationships" xmlns:w="http://schemas.openxmlformats.org/wordprocessingml/2006/main" w:type="paragraph" w:styleId="FontPreviewTimes" w:customStyle="true">
+    <w:name w:val="FontPreviewTimes"/>
+    <w:basedOn w:val="Normal"/>
+    <w:qFormat/>
+    <w:pPr>
+      <w:spacing w:line="480" w:lineRule="auto"/>
+      <w:jc w:val="left"/>
+    </w:pPr>
+    <w:rPr>
+      <w:rFonts w:ascii="Times New Roman" w:hAnsi="Times New Roman" w:eastAsia="Times New Roman" w:cs="Times New Roman"/>
+      <w:color w:val="000000"/>
+      <w:sz w:val="24"/>
+    </w:rPr>
+  </w:style>
+  <w:style xmlns:r="http://schemas.openxmlformats.org/officeDocument/2006/relationships" xmlns:w="http://schemas.openxmlformats.org/wordprocessingml/2006/main" w:type="paragraph" w:styleId="FontPreviewGeorgia" w:customStyle="true">
+    <w:name w:val="FontPreviewGeorgia"/>
+    <w:basedOn w:val="Normal"/>
+    <w:qFormat/>
+    <w:pPr>
+      <w:spacing w:line="480" w:lineRule="auto"/>
+      <w:jc w:val="left"/>
+    </w:pPr>
+    <w:rPr>
+      <w:rFonts w:ascii="Georgia" w:hAnsi="Georgia" w:eastAsia="Georgia" w:cs="Georgia"/>
+      <w:color w:val="000000"/>
+      <w:sz w:val="24"/>
+    </w:rPr>
+  </w:style>
+  <w:style xmlns:r="http://schemas.openxmlformats.org/officeDocument/2006/relationships" xmlns:w="http://schemas.openxmlformats.org/wordprocessingml/2006/main" w:type="paragraph" w:styleId="FontPreviewArial" w:customStyle="true">
+    <w:name w:val="FontPreviewArial"/>
+    <w:basedOn w:val="Normal"/>
+    <w:qFormat/>
+    <w:pPr>
+      <w:spacing w:line="480" w:lineRule="auto"/>
+      <w:jc w:val="left"/>
+    </w:pPr>
+    <w:rPr>
+      <w:rFonts w:ascii="Arial" w:hAnsi="Arial" w:eastAsia="Arial" w:cs="Arial"/>
+      <w:color w:val="000000"/>
+      <w:sz w:val="22"/>
+    </w:rPr>
+  </w:style>
+  <w:style xmlns:r="http://schemas.openxmlformats.org/officeDocument/2006/relationships" xmlns:w="http://schemas.openxmlformats.org/wordprocessingml/2006/main" w:type="table" w:styleId="MockupInfoTable" w:customStyle="true">
+    <w:name w:val="MockupInfoTable"/>
+    <w:basedOn w:val="TableNormal"/>
+    <w:qFormat/>
+    <w:tblPr>
+      <w:tblBorders>
+        <w:top w:val="single" w:color="000000" w:sz="4" w:space="0"/>
+        <w:left w:val="single" w:color="000000" w:sz="4" w:space="0"/>
+        <w:bottom w:val="single" w:color="000000" w:sz="4" w:space="0"/>
+        <w:right w:val="single" w:color="000000" w:sz="4" w:space="0"/>
+        <w:insideH w:val="single" w:color="000000" w:sz="4" w:space="0"/>
+        <w:insideV w:val="single" w:color="000000" w:sz="4" w:space="0"/>
+      </w:tblBorders>
+    </w:tblPr>
   </w:style>
 </w:styles>
 </file>

</xml_diff>

<commit_message>
refactor(module2): consolidate shared content
</commit_message>
<xml_diff>
--- a/word/beda-reference.docx
+++ b/word/beda-reference.docx
@@ -511,8 +511,8 @@
     <w:rPr>
       <w:rFonts w:ascii="Times New Roman" w:hAnsi="Times New Roman" w:eastAsia="Times New Roman" w:cs="Times New Roman"/>
       <w:color w:val="000000"/>
-      <w:sz w:val="24"/>
-      <w:szCs w:val="24"/>
+      <w:sz w:val="22"/>
+      <w:szCs w:val="22"/>
     </w:rPr>
   </w:style>
   <w:style xmlns:r="http://schemas.openxmlformats.org/officeDocument/2006/relationships" xmlns:w="http://schemas.openxmlformats.org/wordprocessingml/2006/main" w:type="paragraph" w:styleId="BodyText">
@@ -521,7 +521,7 @@
     <w:link w:val="BodyTextChar"/>
     <w:qFormat/>
     <w:pPr>
-      <w:spacing w:before="180" w:after="180"/>
+      <w:spacing w:before="180" w:after="120" w:line="276" w:lineRule="auto"/>
     </w:pPr>
   </w:style>
   <w:style xmlns:r="http://schemas.openxmlformats.org/officeDocument/2006/relationships" xmlns:w="http://schemas.openxmlformats.org/wordprocessingml/2006/main" w:type="paragraph" w:styleId="FirstParagraph" w:customStyle="1">
@@ -535,7 +535,7 @@
     <w:basedOn w:val="BodyText"/>
     <w:qFormat/>
     <w:pPr>
-      <w:spacing w:before="36" w:after="36"/>
+      <w:spacing w:before="36" w:after="40" w:line="240" w:lineRule="auto"/>
     </w:pPr>
   </w:style>
   <w:style xmlns:r="http://schemas.openxmlformats.org/officeDocument/2006/relationships" xmlns:w="http://schemas.openxmlformats.org/wordprocessingml/2006/main" w:type="paragraph" w:styleId="Title">
@@ -1075,17 +1075,28 @@
     <w:qFormat/>
     <w:tblPr>
       <w:tblInd w:w="0" w:type="dxa"/>
+      <w:tblBorders>
+        <w:top w:val="single" w:color="000000" w:sz="4" w:space="0"/>
+        <w:left w:val="single" w:color="000000" w:sz="4" w:space="0"/>
+        <w:bottom w:val="single" w:color="000000" w:sz="4" w:space="0"/>
+        <w:right w:val="single" w:color="000000" w:sz="4" w:space="0"/>
+        <w:insideH w:val="single" w:color="000000" w:sz="4" w:space="0"/>
+        <w:insideV w:val="single" w:color="000000" w:sz="4" w:space="0"/>
+      </w:tblBorders>
       <w:tblCellMar>
-        <w:top w:w="0" w:type="dxa"/>
+        <w:top w:w="57" w:type="dxa"/>
         <w:left w:w="108" w:type="dxa"/>
-        <w:bottom w:w="0" w:type="dxa"/>
+        <w:bottom w:w="57" w:type="dxa"/>
         <w:right w:w="108" w:type="dxa"/>
       </w:tblCellMar>
     </w:tblPr>
     <w:tblStylePr w:type="firstRow">
+      <w:rPr>
+        <w:b/>
+      </w:rPr>
       <w:tcPr>
         <w:tcBorders>
-          <w:bottom w:val="single"/>
+          <w:bottom w:val="single" w:color="000000" w:sz="8" w:space="0"/>
         </w:tcBorders>
         <w:vAlign w:val="bottom"/>
       </w:tcPr>
@@ -1200,7 +1211,7 @@
       <w:spacing w:before="160" w:after="200"/>
     </w:pPr>
     <w:rPr>
-      <w:rFonts w:ascii="Times New Roman" w:hAnsi="Times New Roman" w:eastAsia="Times New Roman" w:cs="Times New Roman"/>
+      <w:rFonts w:ascii="Arial" w:hAnsi="Arial" w:eastAsia="Arial" w:cs="Times New Roman"/>
       <w:color w:val="000000"/>
       <w:sz w:val="21"/>
     </w:rPr>
@@ -1282,13 +1293,14 @@
     <w:basedOn w:val="Normal"/>
     <w:qFormat/>
     <w:pPr>
+      <w:spacing w:before="3400" w:after="240" w:line="252" w:lineRule="auto"/>
       <w:jc w:val="left"/>
     </w:pPr>
     <w:rPr>
       <w:rFonts w:ascii="Times New Roman" w:hAnsi="Times New Roman" w:eastAsia="Times New Roman" w:cs="Times New Roman"/>
       <w:b/>
       <w:color w:val="000000"/>
-      <w:sz w:val="32"/>
+      <w:sz w:val="56"/>
     </w:rPr>
   </w:style>
   <w:style xmlns:r="http://schemas.openxmlformats.org/officeDocument/2006/relationships" xmlns:w="http://schemas.openxmlformats.org/wordprocessingml/2006/main" w:type="paragraph" w:styleId="MockupRule" w:customStyle="true">
@@ -1299,7 +1311,7 @@
       <w:pBdr>
         <w:bottom w:val="single" w:sz="4"/>
       </w:pBdr>
-      <w:spacing w:before="120" w:after="240" w:line="240" w:lineRule="auto"/>
+      <w:spacing w:before="240" w:after="960" w:line="240" w:lineRule="auto"/>
     </w:pPr>
     <w:rPr>
       <w:rFonts w:ascii="Times New Roman" w:hAnsi="Times New Roman" w:eastAsia="Times New Roman" w:cs="Times New Roman"/>
@@ -1377,6 +1389,38 @@
         <w:insideV w:val="single" w:color="000000" w:sz="4" w:space="0"/>
       </w:tblBorders>
     </w:tblPr>
+  </w:style>
+  <w:style w:type="paragraph" w:styleId="BEDACoverMeta" w:customStyle="true">
+    <w:name w:val="BEDA Cover Meta"/>
+    <w:basedOn w:val="Normal"/>
+    <w:pPr>
+      <w:spacing w:after="120"/>
+    </w:pPr>
+    <w:rPr>
+      <w:sz w:val="24"/>
+    </w:rPr>
+  </w:style>
+  <w:style w:type="paragraph" w:styleId="BEDACoverSubtitle" w:customStyle="true">
+    <w:name w:val="BEDA Cover Subtitle"/>
+    <w:basedOn w:val="Normal"/>
+    <w:pPr>
+      <w:spacing w:after="240" w:line="252" w:lineRule="auto"/>
+    </w:pPr>
+    <w:rPr>
+      <w:b/>
+      <w:sz w:val="36"/>
+    </w:rPr>
+  </w:style>
+  <w:style w:type="paragraph" w:styleId="BEDACalloutText" w:customStyle="true">
+    <w:name w:val="BEDA Callout Text"/>
+    <w:basedOn w:val="Normal"/>
+    <w:pPr>
+      <w:spacing w:after="80" w:line="276" w:lineRule="auto"/>
+    </w:pPr>
+    <w:rPr>
+      <w:rFonts w:ascii="Arial" w:hAnsi="Arial" w:eastAsia="Arial"/>
+      <w:sz w:val="21"/>
+    </w:rPr>
   </w:style>
 </w:styles>
 </file>

</xml_diff>